<commit_message>
Apply Ch18-19 fix list (and ch20 knock-ons) to merged v2 chapters
Ch18: Gage faces up from the hole (Book 1), the inversion made
deliberate in the blue; the gap line no longer contradicts ch12;
ch12 phrases varied; section 2 trimmed.
Ch19: opens on motion; "No terminal" planted for ch21; Kaan reaches
Ravi unseen; "eleven steps" kept once; dangling "it" fixed; 4055
"back in the drawer"; compassion-anomaly line restored; the notice
travels with Rohan; "no column".
Ch20: Gage at the hole; Daren made himself look; Shu Chan's stillness
and "Do it anyway" lines (author-approved); the mountain image.

Co-Authored-By: Claude Opus 5.5 <noreply@anthropic.com>
</commit_message>
<xml_diff>
--- a/claude-notes/manuscript-v2/18-now-in-the-blue-ii-merged.docx
+++ b/claude-notes/manuscript-v2/18-now-in-the-blue-ii-merged.docx
@@ -177,16 +177,7 @@
           <w:b w:val="0"/>
           <w:i w:val="0"/>
         </w:rPr>
-        <w:t>Middle of a sentence. Now that he knew the sentences were Ben's he knew their shape, and this one had been going somewhere and hadn't got there. It hung in the shaft with its end sheared off.</w:t>
-      </w:r>
-    </w:p>
-    <w:p>
-      <w:r>
-        <w:rPr>
-          <w:b w:val="0"/>
-          <w:i w:val="0"/>
-        </w:rPr>
-        <w:t>The cool kept coming in. The faint steady sound kept its time. Nothing else happened.</w:t>
+        <w:t>Middle of a sentence. It hung in the shaft with its end sheared off.</w:t>
       </w:r>
     </w:p>
     <w:p>
@@ -213,7 +204,7 @@
           <w:b w:val="0"/>
           <w:i w:val="0"/>
         </w:rPr>
-        <w:t>The same sentence. He could tell by its lift, and by the word near the front of it again, blurred this time, a stone seen through moving water. And after the sentence, the gap. The same length, to the beat. Ben had always been like that over a coil on the bench. When it hummed once after an hour of nothing, he didn't shout and he didn't grab. He put everything back where it had been, and did the exact same thing again, and waited to see if it would hum for the same reason.</w:t>
+        <w:t>The same sentence, the word near the front of it blurred this time, a stone seen through moving water. Then the gap. The same length, to the beat. Ben over a coil that had hummed once: put everything back, do it again, wait.</w:t>
       </w:r>
     </w:p>
     <w:p>
@@ -231,7 +222,7 @@
           <w:b w:val="0"/>
           <w:i w:val="0"/>
         </w:rPr>
-        <w:t>He'd thought it was only where Ben breathed. It was a hole left in the air the exact size of an answer. It had a width. The width was a sentence long, and the sentence was his. Ben had been cutting it out for him every time, setting it down at the bottom of the shaft, and going on, and Otto had never once picked it up.</w:t>
+        <w:t>The gap had a width. It was a hole left in the air the exact size of an answer, a sentence long, and the sentence was his. Ben had been cutting it out for him every time, setting it down at the bottom of the shaft, and going on, and Otto had never once picked it up.</w:t>
       </w:r>
     </w:p>
     <w:p>
@@ -258,7 +249,7 @@
           <w:i w:val="0"/>
           <w:color w:val="5C6B7D"/>
         </w:rPr>
-        <w:t xml:space="preserve">, said the small old part of him that still had a mouth on it. </w:t>
+        <w:t xml:space="preserve">, said the old Otto-mobile part of him. </w:t>
       </w:r>
       <w:r>
         <w:rPr>
@@ -293,7 +284,7 @@
           <w:b w:val="0"/>
           <w:i w:val="0"/>
         </w:rPr>
-        <w:t>Two pieces. Gage at the hole, the scar-map white on his brow, face turned down, waiting. Otto had carried that face so long he'd stopped feeling the carrying. Gage had told him to jump. He'd said he would. He hadn't. That was the whole of it, as far as he'd ever let himself take it.</w:t>
+        <w:t>Two pieces. Gage at the hole, the old scar standing out pale, face turned up, waiting. Otto had carried that face so long he'd stopped feeling the carrying. Gage had told him to jump. He'd said he would. He hadn't. That was the whole of it, as far as he'd ever let himself take it.</w:t>
       </w:r>
     </w:p>
     <w:p>
@@ -352,7 +343,7 @@
           <w:b w:val="0"/>
           <w:i w:val="0"/>
         </w:rPr>
-        <w:t>It turned round where it lay, and where it had pressed down on him, it drew up. He looked at Gage's face again, and this time he saw the hands: both of them down over the lip of the hole, open, knuckles skinned, and running down from them into the dark, the promise, a rope let down a shaft. Rough. A knot at every arm's length, the fibres furred at the knots where big hands had been worrying them. At the top of it, Gage had his heels dug in and his whole weight leaned back, the way he'd lean on a stuck valve, and he wasn't letting go of his end, and he wasn't going to.</w:t>
+        <w:t>It turned round where it lay, and where it had pressed down on him, it drew up. In the blue, the hole hung the other way: Gage was above him now, at the lip of it, and he saw the hands: both of them down over the lip of the hole, open, knuckles skinned, and running down from them into the dark, the promise, a rope let down a shaft. Rough. A knot at every arm's length, the fibres furred at the knots where big hands had been worrying them. At the top of it, Gage had his heels dug in and his whole weight leaned back, the way he'd lean on a stuck valve, and he wasn't letting go of his end, and he wasn't going to.</w:t>
       </w:r>
     </w:p>
     <w:p>

</xml_diff>

<commit_message>
Ch18 round 2: promise felt not argued; rope rebuilt; Gretchen at the pump
Co-Authored-By: Claude Opus 5.5 <noreply@anthropic.com>
</commit_message>
<xml_diff>
--- a/claude-notes/manuscript-v2/18-now-in-the-blue-ii-merged.docx
+++ b/claude-notes/manuscript-v2/18-now-in-the-blue-ii-merged.docx
@@ -63,7 +63,7 @@
           <w:i w:val="0"/>
           <w:strike w:val="0"/>
         </w:rPr>
-        <w:t>It went from under him first, the backs of his knees, then the hollow of his spine, then everywhere, like a tide pulling off a rock somebody's been asleep on. The cool came in behind it. The pull came into his arms and asked, and went.</w:t>
+        <w:t>It went from under him first, the backs of his knees, then the hollow of his spine, then everywhere. The cool came in behind it. The pull came into his arms and asked, and went.</w:t>
       </w:r>
     </w:p>
     <w:p>
@@ -124,7 +124,7 @@
           <w:i w:val="0"/>
           <w:strike w:val="0"/>
         </w:rPr>
-        <w:t>The picture came with it, so sharp after all the blue that it ached somewhere behind his eyes. A small girl at the gates, in a coat too big for her, the cuffs turned back twice by someone else's hands. Ben's sister. Ben said her name like a man patting a pocket to check something was still in it.</w:t>
+        <w:t>The picture came with it, so sharp after all the blue that it ached somewhere behind his eyes. A girl at the water pump, sleeves turned back, saying something that made Ben stop and listen. Ben's sister. Ben said her name like a man patting a pocket to check something was still in it.</w:t>
       </w:r>
     </w:p>
     <w:p>
@@ -264,7 +264,7 @@
           <w:i w:val="0"/>
           <w:strike w:val="0"/>
         </w:rPr>
-        <w:t>He couldn't now. He tried, and the stillness drank the trying. But he could feel the edges of the gap the way you feel the edges of a chair in a room with no lamp, and he knew who it was for.</w:t>
+        <w:t>He couldn't now. He tried, and the stillness drank the trying. But he could feel the edges of the gap, and he knew who it was for.</w:t>
       </w:r>
     </w:p>
     <w:p>
@@ -353,23 +353,7 @@
           <w:i w:val="0"/>
           <w:strike w:val="0"/>
         </w:rPr>
-        <w:t xml:space="preserve">Otto turned that over. A sentence you go back to isn't finished. A promise only broke when the one who'd made it quit, and he hadn't quit. He was still down here holding the floor, still answering every pull in his arms. He hadn't jumped </w:t>
-      </w:r>
-      <w:r>
-        <w:rPr>
-          <w:b w:val="0"/>
-          <w:i/>
-          <w:strike w:val="0"/>
-        </w:rPr>
-        <w:t>yet</w:t>
-      </w:r>
-      <w:r>
-        <w:rPr>
-          <w:b w:val="0"/>
-          <w:i w:val="0"/>
-          <w:strike w:val="0"/>
-        </w:rPr>
-        <w:t>, was all.</w:t>
+        <w:t>Otto turned that over. A sentence you go back to isn't finished. He hadn't jumped. Yet.</w:t>
       </w:r>
     </w:p>
     <w:p>
@@ -399,7 +383,7 @@
           <w:i w:val="0"/>
           <w:strike w:val="0"/>
         </w:rPr>
-        <w:t>It turned round where it lay, and where it had pressed down on him, it drew up. In the blue, the hole hung the other way: Gage was above him now, at the lip of it, and he saw the hands: both of them down over the lip of the hole, open, knuckles skinned, and running down from them into the dark, the promise, a rope let down a shaft. Rough. A knot at every arm's length, the fibres furred at the knots where big hands had been worrying them. At the top of it, Gage had his heels dug in and his whole weight leaned back, the way he'd lean on a stuck valve, and he wasn't letting go of his end, and he wasn't going to.</w:t>
+        <w:t>It turned round where it lay, and where it had pressed down on him, it drew up. In the blue, the hole hung the other way. Gage was above him now, at the lip, knuckles skinned. Down from his fists into the dark ran the promise, and it was a rope: rough, a knot at every arm's length, the fibres furred where big hands had been worrying them, and one knot thicker than the rest, where two pieces had been tied back together. Up top, Gage had his heels dug in and his whole weight leaned back, and he wasn't letting go of his end, and he wasn't going to.</w:t>
       </w:r>
     </w:p>
     <w:p>

</xml_diff>

<commit_message>
Ch18 round 3: Gretchen and Leroy memory; Otto restarts his own promise
Co-Authored-By: Claude Opus 5.5 <noreply@anthropic.com>
</commit_message>
<xml_diff>
--- a/claude-notes/manuscript-v2/18-now-in-the-blue-ii-merged.docx
+++ b/claude-notes/manuscript-v2/18-now-in-the-blue-ii-merged.docx
@@ -124,7 +124,7 @@
           <w:i w:val="0"/>
           <w:strike w:val="0"/>
         </w:rPr>
-        <w:t>The picture came with it, so sharp after all the blue that it ached somewhere behind his eyes. A girl at the water pump, sleeves turned back, saying something that made Ben stop and listen. Ben's sister. Ben said her name like a man patting a pocket to check something was still in it.</w:t>
+        <w:t>The picture came with it, so sharp after all the blue that it ached somewhere behind his eyes. A girl at the water pump, sleeves turned back, telling Ben a man who'd hurt them was still worth saving. Ben's sister. Ben said her name quick and low, and always looked up after, checking she was still there.</w:t>
       </w:r>
     </w:p>
     <w:p>
@@ -333,7 +333,7 @@
           <w:i w:val="0"/>
           <w:strike w:val="0"/>
         </w:rPr>
-        <w:t>Two pieces. Gage at the hole, the old scar standing out pale, face turned up, waiting. Otto had carried that face so long he'd stopped feeling the carrying. Gage had told him to jump. He'd said he would. He hadn't. That was the whole of it, as far as he'd ever let himself take it.</w:t>
+        <w:t>Two pieces. Gage at the hole, the old scar standing out pale, face turned up, waiting. Otto had carried that face so long he'd stopped feeling the carrying. Gage had told him to jump. He'd said he would. He hadn't.</w:t>
       </w:r>
     </w:p>
     <w:p>
@@ -353,7 +353,23 @@
           <w:i w:val="0"/>
           <w:strike w:val="0"/>
         </w:rPr>
-        <w:t>Otto turned that over. A sentence you go back to isn't finished. He hadn't jumped. Yet.</w:t>
+        <w:t xml:space="preserve">Otto turned that over. Then he did the one thing he could. He went back to the front of his own sentence and said it again, inside, slow. </w:t>
+      </w:r>
+      <w:r>
+        <w:rPr>
+          <w:b w:val="0"/>
+          <w:i/>
+          <w:strike w:val="0"/>
+        </w:rPr>
+        <w:t>I promise, brother.</w:t>
+      </w:r>
+      <w:r>
+        <w:rPr>
+          <w:b w:val="0"/>
+          <w:i w:val="0"/>
+          <w:strike w:val="0"/>
+        </w:rPr>
+        <w:t xml:space="preserve"> Jump through after. After was a word with a later in it.</w:t>
       </w:r>
     </w:p>
     <w:p>

</xml_diff>